<commit_message>
Auto sync 2026-09-15 09:23:20
</commit_message>
<xml_diff>
--- a/09-设计与原型/17-订单履约时效管理原型/订单履约时效管理PRD_V1.1_20260911.docx
+++ b/09-设计与原型/17-订单履约时效管理原型/订单履约时效管理PRD_V1.1_20260911.docx
@@ -7572,7 +7572,543 @@
         <w:pStyle w:val="Heading2"/>
       </w:pPr>
       <w:r>
-        <w:t>10 2 集成事件与责任边界</w:t>
+        <w:t>10 2 拆单 合单与旺店通驳回重组的时效继承</w:t>
+      </w:r>
+    </w:p>
+    <w:p>
+      <w:r>
+        <w:t>拆单、合单和旺店通驳回后的重组只改变履约单据结构，不改变客户已经获得的履约承诺。重组不得重新起算、顺延截止或消除已产生的预警和超时。系统以原订单规则快照和当前节点的权威业务事件为依据，生成新的履约单任务映射，并完整保留来源单、处理批次、处理时间和操作者。</w:t>
+      </w:r>
+    </w:p>
+    <w:tbl>
+      <w:tblPr>
+        <w:tblW w:type="auto" w:w="0"/>
+        <w:jc w:val="center"/>
+        <w:tblLayout w:type="fixed"/>
+        <w:tblLook w:firstColumn="1" w:firstRow="1" w:lastColumn="0" w:lastRow="0" w:noHBand="0" w:noVBand="1" w:val="04A0"/>
+        <w:tblBorders>
+          <w:top w:val="single" w:sz="5" w:color="D9D9D9"/>
+          <w:left w:val="single" w:sz="5" w:color="D9D9D9"/>
+          <w:bottom w:val="single" w:sz="5" w:color="D9D9D9"/>
+          <w:right w:val="single" w:sz="5" w:color="D9D9D9"/>
+          <w:insideH w:val="single" w:sz="5" w:color="D9D9D9"/>
+          <w:insideV w:val="single" w:sz="5" w:color="D9D9D9"/>
+        </w:tblBorders>
+      </w:tblPr>
+      <w:tblGrid>
+        <w:gridCol w:w="2477"/>
+        <w:gridCol w:w="7315"/>
+        <w:gridCol w:w="1958"/>
+        <w:gridCol w:w="1958"/>
+        <w:gridCol w:w="1958"/>
+      </w:tblGrid>
+      <w:tr>
+        <w:trPr>
+          <w:cantSplit/>
+          <w:tblHeader/>
+        </w:trPr>
+        <w:tc>
+          <w:tcPr>
+            <w:tcW w:type="dxa" w:w="2477"/>
+            <w:vAlign w:val="center"/>
+            <w:shd w:fill="253F5D"/>
+            <w:tcMar>
+              <w:top w:w="80" w:type="dxa"/>
+              <w:bottom w:w="80" w:type="dxa"/>
+              <w:left w:w="105" w:type="dxa"/>
+              <w:right w:w="105" w:type="dxa"/>
+            </w:tcMar>
+          </w:tcPr>
+          <w:p>
+            <w:pPr>
+              <w:keepNext/>
+              <w:spacing w:after="0" w:before="0" w:line="276" w:lineRule="auto"/>
+              <w:jc w:val="center"/>
+            </w:pPr>
+            <w:r>
+              <w:rPr>
+                <w:b/>
+                <w:color w:val="FFFFFF"/>
+                <w:sz w:val="21"/>
+              </w:rPr>
+              <w:t>场景</w:t>
+            </w:r>
+          </w:p>
+        </w:tc>
+        <w:tc>
+          <w:tcPr>
+            <w:tcW w:type="dxa" w:w="7315"/>
+            <w:vAlign w:val="center"/>
+            <w:shd w:fill="253F5D"/>
+            <w:tcMar>
+              <w:top w:w="80" w:type="dxa"/>
+              <w:bottom w:w="80" w:type="dxa"/>
+              <w:left w:w="105" w:type="dxa"/>
+              <w:right w:w="105" w:type="dxa"/>
+            </w:tcMar>
+          </w:tcPr>
+          <w:p>
+            <w:pPr>
+              <w:keepNext/>
+              <w:spacing w:after="0" w:before="0" w:line="276" w:lineRule="auto"/>
+              <w:jc w:val="center"/>
+            </w:pPr>
+            <w:r>
+              <w:rPr>
+                <w:b/>
+                <w:color w:val="FFFFFF"/>
+                <w:sz w:val="21"/>
+              </w:rPr>
+              <w:t>计时继承</w:t>
+            </w:r>
+          </w:p>
+        </w:tc>
+        <w:tc>
+          <w:tcPr>
+            <w:tcW w:type="dxa" w:w="1958"/>
+          </w:tcPr>
+          <w:p/>
+        </w:tc>
+        <w:tc>
+          <w:tcPr>
+            <w:tcW w:type="dxa" w:w="1958"/>
+          </w:tcPr>
+          <w:p/>
+        </w:tc>
+        <w:tc>
+          <w:tcPr>
+            <w:tcW w:type="dxa" w:w="1958"/>
+          </w:tcPr>
+          <w:p/>
+        </w:tc>
+      </w:tr>
+      <w:tr>
+        <w:trPr>
+          <w:cantSplit/>
+        </w:trPr>
+        <w:tc>
+          <w:tcPr>
+            <w:tcW w:type="dxa" w:w="2477"/>
+            <w:vAlign w:val="center"/>
+            <w:shd w:fill="FFFFFF"/>
+            <w:tcMar>
+              <w:top w:w="80" w:type="dxa"/>
+              <w:bottom w:w="80" w:type="dxa"/>
+              <w:left w:w="105" w:type="dxa"/>
+              <w:right w:w="105" w:type="dxa"/>
+            </w:tcMar>
+          </w:tcPr>
+          <w:p>
+            <w:pPr>
+              <w:keepNext w:val="0"/>
+              <w:spacing w:after="0" w:before="0" w:line="276" w:lineRule="auto"/>
+              <w:jc w:val="center"/>
+            </w:pPr>
+            <w:r>
+              <w:rPr>
+                <w:b w:val="0"/>
+                <w:color w:val="000000"/>
+                <w:sz w:val="21"/>
+              </w:rPr>
+              <w:t>一拆多</w:t>
+            </w:r>
+          </w:p>
+        </w:tc>
+        <w:tc>
+          <w:tcPr>
+            <w:tcW w:type="dxa" w:w="7315"/>
+            <w:vAlign w:val="center"/>
+            <w:shd w:fill="FFFFFF"/>
+            <w:tcMar>
+              <w:top w:w="80" w:type="dxa"/>
+              <w:bottom w:w="80" w:type="dxa"/>
+              <w:left w:w="105" w:type="dxa"/>
+              <w:right w:w="105" w:type="dxa"/>
+            </w:tcMar>
+          </w:tcPr>
+          <w:p>
+            <w:pPr>
+              <w:keepNext w:val="0"/>
+              <w:spacing w:after="0" w:before="0" w:line="276" w:lineRule="auto"/>
+            </w:pPr>
+            <w:r>
+              <w:rPr>
+                <w:b w:val="0"/>
+                <w:color w:val="000000"/>
+                <w:sz w:val="21"/>
+              </w:rPr>
+              <w:t>每张有效子发货单继承来源单当前发货节点的起算时间、规则快照和已用时</w:t>
+            </w:r>
+          </w:p>
+        </w:tc>
+        <w:tc>
+          <w:tcPr>
+            <w:tcW w:type="dxa" w:w="1958"/>
+          </w:tcPr>
+          <w:p/>
+        </w:tc>
+        <w:tc>
+          <w:tcPr>
+            <w:tcW w:type="dxa" w:w="1958"/>
+          </w:tcPr>
+          <w:p/>
+        </w:tc>
+        <w:tc>
+          <w:tcPr>
+            <w:tcW w:type="dxa" w:w="1958"/>
+          </w:tcPr>
+          <w:p/>
+        </w:tc>
+      </w:tr>
+      <w:tr>
+        <w:trPr>
+          <w:cantSplit/>
+        </w:trPr>
+        <w:tc>
+          <w:tcPr>
+            <w:tcW w:type="dxa" w:w="2477"/>
+            <w:vAlign w:val="center"/>
+            <w:shd w:fill="F4F7FA"/>
+            <w:tcMar>
+              <w:top w:w="80" w:type="dxa"/>
+              <w:bottom w:w="80" w:type="dxa"/>
+              <w:left w:w="105" w:type="dxa"/>
+              <w:right w:w="105" w:type="dxa"/>
+            </w:tcMar>
+          </w:tcPr>
+          <w:p>
+            <w:pPr>
+              <w:keepNext w:val="0"/>
+              <w:spacing w:after="0" w:before="0" w:line="276" w:lineRule="auto"/>
+              <w:jc w:val="center"/>
+            </w:pPr>
+            <w:r>
+              <w:rPr>
+                <w:b w:val="0"/>
+                <w:color w:val="000000"/>
+                <w:sz w:val="21"/>
+              </w:rPr>
+              <w:t>多合一</w:t>
+            </w:r>
+          </w:p>
+        </w:tc>
+        <w:tc>
+          <w:tcPr>
+            <w:tcW w:type="dxa" w:w="7315"/>
+            <w:vAlign w:val="center"/>
+            <w:shd w:fill="F4F7FA"/>
+            <w:tcMar>
+              <w:top w:w="80" w:type="dxa"/>
+              <w:bottom w:w="80" w:type="dxa"/>
+              <w:left w:w="105" w:type="dxa"/>
+              <w:right w:w="105" w:type="dxa"/>
+            </w:tcMar>
+          </w:tcPr>
+          <w:p>
+            <w:pPr>
+              <w:keepNext w:val="0"/>
+              <w:spacing w:after="0" w:before="0" w:line="276" w:lineRule="auto"/>
+            </w:pPr>
+            <w:r>
+              <w:rPr>
+                <w:b w:val="0"/>
+                <w:color w:val="000000"/>
+                <w:sz w:val="21"/>
+              </w:rPr>
+              <w:t>合并单承接全部有效来源单的未完成履约任务和已用时</w:t>
+            </w:r>
+          </w:p>
+        </w:tc>
+        <w:tc>
+          <w:tcPr>
+            <w:tcW w:type="dxa" w:w="1958"/>
+          </w:tcPr>
+          <w:p/>
+        </w:tc>
+        <w:tc>
+          <w:tcPr>
+            <w:tcW w:type="dxa" w:w="1958"/>
+          </w:tcPr>
+          <w:p/>
+        </w:tc>
+        <w:tc>
+          <w:tcPr>
+            <w:tcW w:type="dxa" w:w="1958"/>
+          </w:tcPr>
+          <w:p/>
+        </w:tc>
+      </w:tr>
+      <w:tr>
+        <w:trPr>
+          <w:cantSplit/>
+        </w:trPr>
+        <w:tc>
+          <w:tcPr>
+            <w:tcW w:type="dxa" w:w="2477"/>
+            <w:vAlign w:val="center"/>
+            <w:shd w:fill="FFFFFF"/>
+            <w:tcMar>
+              <w:top w:w="80" w:type="dxa"/>
+              <w:bottom w:w="80" w:type="dxa"/>
+              <w:left w:w="105" w:type="dxa"/>
+              <w:right w:w="105" w:type="dxa"/>
+            </w:tcMar>
+          </w:tcPr>
+          <w:p>
+            <w:pPr>
+              <w:keepNext w:val="0"/>
+              <w:spacing w:after="0" w:before="0" w:line="276" w:lineRule="auto"/>
+              <w:jc w:val="center"/>
+            </w:pPr>
+            <w:r>
+              <w:rPr>
+                <w:b w:val="0"/>
+                <w:color w:val="000000"/>
+                <w:sz w:val="21"/>
+              </w:rPr>
+              <w:t>旺店通驳回后拆单或合单</w:t>
+            </w:r>
+          </w:p>
+        </w:tc>
+        <w:tc>
+          <w:tcPr>
+            <w:tcW w:type="dxa" w:w="7315"/>
+            <w:vAlign w:val="center"/>
+            <w:shd w:fill="FFFFFF"/>
+            <w:tcMar>
+              <w:top w:w="80" w:type="dxa"/>
+              <w:bottom w:w="80" w:type="dxa"/>
+              <w:left w:w="105" w:type="dxa"/>
+              <w:right w:w="105" w:type="dxa"/>
+            </w:tcMar>
+          </w:tcPr>
+          <w:p>
+            <w:pPr>
+              <w:keepNext w:val="0"/>
+              <w:spacing w:after="0" w:before="0" w:line="276" w:lineRule="auto"/>
+            </w:pPr>
+            <w:r>
+              <w:rPr>
+                <w:b w:val="0"/>
+                <w:color w:val="000000"/>
+                <w:sz w:val="21"/>
+              </w:rPr>
+              <w:t>从被驳回单原发货节点继续计时，驳回等待和重组操作时间均计入已用时</w:t>
+            </w:r>
+          </w:p>
+        </w:tc>
+        <w:tc>
+          <w:tcPr>
+            <w:tcW w:type="dxa" w:w="1958"/>
+          </w:tcPr>
+          <w:p/>
+        </w:tc>
+        <w:tc>
+          <w:tcPr>
+            <w:tcW w:type="dxa" w:w="1958"/>
+          </w:tcPr>
+          <w:p/>
+        </w:tc>
+        <w:tc>
+          <w:tcPr>
+            <w:tcW w:type="dxa" w:w="1958"/>
+          </w:tcPr>
+          <w:p/>
+        </w:tc>
+      </w:tr>
+      <w:tr>
+        <w:trPr>
+          <w:cantSplit/>
+        </w:trPr>
+        <w:tc>
+          <w:tcPr>
+            <w:tcW w:type="dxa" w:w="2477"/>
+            <w:vAlign w:val="center"/>
+            <w:shd w:fill="F4F7FA"/>
+            <w:tcMar>
+              <w:top w:w="80" w:type="dxa"/>
+              <w:bottom w:w="80" w:type="dxa"/>
+              <w:left w:w="105" w:type="dxa"/>
+              <w:right w:w="105" w:type="dxa"/>
+            </w:tcMar>
+          </w:tcPr>
+          <w:p>
+            <w:pPr>
+              <w:keepNext w:val="0"/>
+              <w:spacing w:after="0" w:before="0" w:line="276" w:lineRule="auto"/>
+              <w:jc w:val="center"/>
+            </w:pPr>
+            <w:r>
+              <w:rPr>
+                <w:b w:val="0"/>
+                <w:color w:val="000000"/>
+                <w:sz w:val="21"/>
+              </w:rPr>
+              <w:t>驳回后原单直接重试</w:t>
+            </w:r>
+          </w:p>
+        </w:tc>
+        <w:tc>
+          <w:tcPr>
+            <w:tcW w:type="dxa" w:w="7315"/>
+            <w:vAlign w:val="center"/>
+            <w:shd w:fill="F4F7FA"/>
+            <w:tcMar>
+              <w:top w:w="80" w:type="dxa"/>
+              <w:bottom w:w="80" w:type="dxa"/>
+              <w:left w:w="105" w:type="dxa"/>
+              <w:right w:w="105" w:type="dxa"/>
+            </w:tcMar>
+          </w:tcPr>
+          <w:p>
+            <w:pPr>
+              <w:keepNext w:val="0"/>
+              <w:spacing w:after="0" w:before="0" w:line="276" w:lineRule="auto"/>
+            </w:pPr>
+            <w:r>
+              <w:rPr>
+                <w:b w:val="0"/>
+                <w:color w:val="000000"/>
+                <w:sz w:val="21"/>
+              </w:rPr>
+              <w:t>不生成新履约单，不暂停或重置计时</w:t>
+            </w:r>
+          </w:p>
+        </w:tc>
+        <w:tc>
+          <w:tcPr>
+            <w:tcW w:type="dxa" w:w="1958"/>
+          </w:tcPr>
+          <w:p/>
+        </w:tc>
+        <w:tc>
+          <w:tcPr>
+            <w:tcW w:type="dxa" w:w="1958"/>
+          </w:tcPr>
+          <w:p/>
+        </w:tc>
+        <w:tc>
+          <w:tcPr>
+            <w:tcW w:type="dxa" w:w="1958"/>
+          </w:tcPr>
+          <w:p/>
+        </w:tc>
+      </w:tr>
+      <w:tr>
+        <w:trPr>
+          <w:cantSplit/>
+        </w:trPr>
+        <w:tc>
+          <w:tcPr>
+            <w:tcW w:type="dxa" w:w="2477"/>
+            <w:vAlign w:val="center"/>
+            <w:shd w:fill="FFFFFF"/>
+            <w:tcMar>
+              <w:top w:w="80" w:type="dxa"/>
+              <w:bottom w:w="80" w:type="dxa"/>
+              <w:left w:w="105" w:type="dxa"/>
+              <w:right w:w="105" w:type="dxa"/>
+            </w:tcMar>
+          </w:tcPr>
+          <w:p>
+            <w:pPr>
+              <w:keepNext w:val="0"/>
+              <w:spacing w:after="0" w:before="0" w:line="276" w:lineRule="auto"/>
+              <w:jc w:val="center"/>
+            </w:pPr>
+            <w:r>
+              <w:rPr>
+                <w:b w:val="0"/>
+                <w:color w:val="000000"/>
+                <w:sz w:val="21"/>
+              </w:rPr>
+              <w:t>旺店通已接收</w:t>
+            </w:r>
+          </w:p>
+        </w:tc>
+        <w:tc>
+          <w:tcPr>
+            <w:tcW w:type="dxa" w:w="7315"/>
+            <w:vAlign w:val="center"/>
+            <w:shd w:fill="FFFFFF"/>
+            <w:tcMar>
+              <w:top w:w="80" w:type="dxa"/>
+              <w:bottom w:w="80" w:type="dxa"/>
+              <w:left w:w="105" w:type="dxa"/>
+              <w:right w:w="105" w:type="dxa"/>
+            </w:tcMar>
+          </w:tcPr>
+          <w:p>
+            <w:pPr>
+              <w:keepNext w:val="0"/>
+              <w:spacing w:after="0" w:before="0" w:line="276" w:lineRule="auto"/>
+            </w:pPr>
+            <w:r>
+              <w:rPr>
+                <w:b w:val="0"/>
+                <w:color w:val="000000"/>
+                <w:sz w:val="21"/>
+              </w:rPr>
+              <w:t>已进入外部执行链路，保持当前计时与状态</w:t>
+            </w:r>
+          </w:p>
+        </w:tc>
+        <w:tc>
+          <w:tcPr>
+            <w:tcW w:type="dxa" w:w="1958"/>
+          </w:tcPr>
+          <w:p/>
+        </w:tc>
+        <w:tc>
+          <w:tcPr>
+            <w:tcW w:type="dxa" w:w="1958"/>
+          </w:tcPr>
+          <w:p/>
+        </w:tc>
+        <w:tc>
+          <w:tcPr>
+            <w:tcW w:type="dxa" w:w="1958"/>
+          </w:tcPr>
+          <w:p/>
+        </w:tc>
+      </w:tr>
+    </w:tbl>
+    <w:p>
+      <w:pPr>
+        <w:spacing w:after="40" w:before="0" w:line="240" w:lineRule="auto"/>
+      </w:pPr>
+      <w:r>
+        <w:rPr>
+          <w:sz w:val="4"/>
+        </w:rPr>
+      </w:r>
+    </w:p>
+    <w:p>
+      <w:r>
+        <w:t>一拆多时，只要任一有效子单未完成，订单级当前节点仍未完成；全部有效子单完成后，订单级节点完成时间取最后一张子单的完成时间。子单分别保留正常、预警、超时、已完成或待判定状态，不能用已完成子单掩盖其他子单的风险。</w:t>
+      </w:r>
+    </w:p>
+    <w:p>
+      <w:r>
+        <w:t>多合一只允许合并业务约束兼容且尚可重组的发货单。合并前须校验客户与收货信息、发货主体、温层或物流约束、当前有效商品数量、节点阶段以及旺店通同步状态。任一来源单已被旺店通接收时，整次合单失败，系统指出具体单号并保留用户当前选择；不得跳过该来源单生成部分结果。</w:t>
+      </w:r>
+    </w:p>
+    <w:p>
+      <w:r>
+        <w:t>告警记录同时保存履约承接单ID和业务归属订单ID。操作入口、待办和消息发送归当前有效履约单；订单总览、客户统计和SLA结果归原业务订单并按订单ID去重。合单涉及多个原订单时，各原订单保留各自SLA结果，合并单页面展示最严重状态，不能把多个订单合成一个统计订单。</w:t>
+      </w:r>
+    </w:p>
+    <w:p>
+      <w:r>
+        <w:t>重组事务成功后再停用来源单并启用结果单。若重组、数据写入或重新同步提交失败，来源单和原告警继续有效，系统保留用户选择并提示失败原因和重试入口，禁止出现来源单已关闭但结果单未创建的中间状态。所有继承与聚合按北京时间和权威服务端时间计算。</w:t>
+      </w:r>
+    </w:p>
+    <w:p>
+      <w:pPr>
+        <w:pStyle w:val="Heading2"/>
+      </w:pPr>
+      <w:r>
+        <w:t>10 3 集成事件与责任边界</w:t>
       </w:r>
     </w:p>
     <w:p>
@@ -8494,7 +9030,7 @@
         <w:pStyle w:val="Heading2"/>
       </w:pPr>
       <w:r>
-        <w:t>10 3 消息与异常动作</w:t>
+        <w:t>10 4 消息与异常动作</w:t>
       </w:r>
     </w:p>
     <w:p>
@@ -9015,6 +9551,126 @@
                 <w:sz w:val="21"/>
               </w:rPr>
               <w:t>订单或履约单ID 节点 起算 截止 提醒 完成时间 当前状态</w:t>
+            </w:r>
+          </w:p>
+        </w:tc>
+      </w:tr>
+      <w:tr>
+        <w:trPr>
+          <w:cantSplit/>
+        </w:trPr>
+        <w:tc>
+          <w:tcPr>
+            <w:tcW w:type="dxa" w:w="2477"/>
+            <w:vAlign w:val="center"/>
+            <w:shd w:fill="F4F7FA"/>
+            <w:tcMar>
+              <w:top w:w="80" w:type="dxa"/>
+              <w:bottom w:w="80" w:type="dxa"/>
+              <w:left w:w="105" w:type="dxa"/>
+              <w:right w:w="105" w:type="dxa"/>
+            </w:tcMar>
+          </w:tcPr>
+          <w:p>
+            <w:pPr>
+              <w:keepNext w:val="0"/>
+              <w:spacing w:after="0" w:before="0" w:line="276" w:lineRule="auto"/>
+              <w:jc w:val="center"/>
+            </w:pPr>
+            <w:r>
+              <w:rPr>
+                <w:b w:val="0"/>
+                <w:color w:val="000000"/>
+                <w:sz w:val="21"/>
+              </w:rPr>
+              <w:t>履约单关系</w:t>
+            </w:r>
+          </w:p>
+        </w:tc>
+        <w:tc>
+          <w:tcPr>
+            <w:tcW w:type="dxa" w:w="7315"/>
+            <w:vAlign w:val="center"/>
+            <w:shd w:fill="F4F7FA"/>
+            <w:tcMar>
+              <w:top w:w="80" w:type="dxa"/>
+              <w:bottom w:w="80" w:type="dxa"/>
+              <w:left w:w="105" w:type="dxa"/>
+              <w:right w:w="105" w:type="dxa"/>
+            </w:tcMar>
+          </w:tcPr>
+          <w:p>
+            <w:pPr>
+              <w:keepNext w:val="0"/>
+              <w:spacing w:after="0" w:before="0" w:line="276" w:lineRule="auto"/>
+            </w:pPr>
+            <w:r>
+              <w:rPr>
+                <w:b w:val="0"/>
+                <w:color w:val="000000"/>
+                <w:sz w:val="21"/>
+              </w:rPr>
+              <w:t>关系批次ID 来源履约单 结果履约单 拆合类型 生效状态 操作者与时间</w:t>
+            </w:r>
+          </w:p>
+        </w:tc>
+      </w:tr>
+      <w:tr>
+        <w:trPr>
+          <w:cantSplit/>
+        </w:trPr>
+        <w:tc>
+          <w:tcPr>
+            <w:tcW w:type="dxa" w:w="2477"/>
+            <w:vAlign w:val="center"/>
+            <w:shd w:fill="FFFFFF"/>
+            <w:tcMar>
+              <w:top w:w="80" w:type="dxa"/>
+              <w:bottom w:w="80" w:type="dxa"/>
+              <w:left w:w="105" w:type="dxa"/>
+              <w:right w:w="105" w:type="dxa"/>
+            </w:tcMar>
+          </w:tcPr>
+          <w:p>
+            <w:pPr>
+              <w:keepNext w:val="0"/>
+              <w:spacing w:after="0" w:before="0" w:line="276" w:lineRule="auto"/>
+              <w:jc w:val="center"/>
+            </w:pPr>
+            <w:r>
+              <w:rPr>
+                <w:b w:val="0"/>
+                <w:color w:val="000000"/>
+                <w:sz w:val="21"/>
+              </w:rPr>
+              <w:t>时效继承快照</w:t>
+            </w:r>
+          </w:p>
+        </w:tc>
+        <w:tc>
+          <w:tcPr>
+            <w:tcW w:type="dxa" w:w="7315"/>
+            <w:vAlign w:val="center"/>
+            <w:shd w:fill="FFFFFF"/>
+            <w:tcMar>
+              <w:top w:w="80" w:type="dxa"/>
+              <w:bottom w:w="80" w:type="dxa"/>
+              <w:left w:w="105" w:type="dxa"/>
+              <w:right w:w="105" w:type="dxa"/>
+            </w:tcMar>
+          </w:tcPr>
+          <w:p>
+            <w:pPr>
+              <w:keepNext w:val="0"/>
+              <w:spacing w:after="0" w:before="0" w:line="276" w:lineRule="auto"/>
+            </w:pPr>
+            <w:r>
+              <w:rPr>
+                <w:b w:val="0"/>
+                <w:color w:val="000000"/>
+                <w:sz w:val="21"/>
+              </w:rPr>
+              <w:t>关系批次ID 原订单ID 来源任务ID 结果任务ID 原起算 原截止 已用时 告警承接关系</w:t>
             </w:r>
           </w:p>
         </w:tc>
@@ -9263,7 +9919,7 @@
     </w:p>
     <w:p>
       <w:r>
-        <w:t>明确一单多发货单、多包裹、部分出库、部分签收时，以首次、全部完成还是逐履约单计时。确认未发剩余商品、补发、少收及分批回执如何保留待办。建议保留订单总览去重与履约单明细两层，但需业务定版。</w:t>
+        <w:t>拆合单已确定采用“履约单分别判定、原订单汇总去重”的两层口径：一拆多全部有效子单完成后订单级节点才完成；多合一的各原订单保留独立SLA结果，合并单以最早截止和最严重状态驱动执行。仍需明确非拆合产生的多包裹、部分出库、部分签收，以首次、全部完成还是逐包裹计时，以及补发、少收和分批回执如何保留待办。</w:t>
       </w:r>
     </w:p>
     <w:p>
@@ -11878,6 +12534,441 @@
                 <w:sz w:val="21"/>
               </w:rPr>
               <w:t>工厂可接单或继续拒接 每轮记录完整保留</w:t>
+            </w:r>
+          </w:p>
+        </w:tc>
+      </w:tr>
+      <w:tr>
+        <w:trPr>
+          <w:cantSplit/>
+        </w:trPr>
+        <w:tc>
+          <w:tcPr>
+            <w:tcW w:type="dxa" w:w="835"/>
+            <w:vAlign w:val="center"/>
+            <w:shd w:fill="FFFFFF"/>
+            <w:tcMar>
+              <w:top w:w="80" w:type="dxa"/>
+              <w:bottom w:w="80" w:type="dxa"/>
+              <w:left w:w="105" w:type="dxa"/>
+              <w:right w:w="105" w:type="dxa"/>
+            </w:tcMar>
+          </w:tcPr>
+          <w:p>
+            <w:pPr>
+              <w:keepNext w:val="0"/>
+              <w:spacing w:after="0" w:before="0" w:line="276" w:lineRule="auto"/>
+              <w:jc w:val="center"/>
+            </w:pPr>
+            <w:r>
+              <w:rPr>
+                <w:b w:val="0"/>
+                <w:color w:val="000000"/>
+                <w:sz w:val="21"/>
+              </w:rPr>
+              <w:t>A28</w:t>
+            </w:r>
+          </w:p>
+        </w:tc>
+        <w:tc>
+          <w:tcPr>
+            <w:tcW w:type="dxa" w:w="3686"/>
+            <w:vAlign w:val="center"/>
+            <w:shd w:fill="FFFFFF"/>
+            <w:tcMar>
+              <w:top w:w="80" w:type="dxa"/>
+              <w:bottom w:w="80" w:type="dxa"/>
+              <w:left w:w="105" w:type="dxa"/>
+              <w:right w:w="105" w:type="dxa"/>
+            </w:tcMar>
+          </w:tcPr>
+          <w:p>
+            <w:pPr>
+              <w:keepNext w:val="0"/>
+              <w:spacing w:after="0" w:before="0" w:line="276" w:lineRule="auto"/>
+            </w:pPr>
+            <w:r>
+              <w:rPr>
+                <w:b w:val="0"/>
+                <w:color w:val="000000"/>
+                <w:sz w:val="21"/>
+              </w:rPr>
+              <w:t>一张未同步发货单拆为三张子单</w:t>
+            </w:r>
+          </w:p>
+        </w:tc>
+        <w:tc>
+          <w:tcPr>
+            <w:tcW w:type="dxa" w:w="5270"/>
+            <w:vAlign w:val="center"/>
+            <w:shd w:fill="FFFFFF"/>
+            <w:tcMar>
+              <w:top w:w="80" w:type="dxa"/>
+              <w:bottom w:w="80" w:type="dxa"/>
+              <w:left w:w="105" w:type="dxa"/>
+              <w:right w:w="105" w:type="dxa"/>
+            </w:tcMar>
+          </w:tcPr>
+          <w:p>
+            <w:pPr>
+              <w:keepNext w:val="0"/>
+              <w:spacing w:after="0" w:before="0" w:line="276" w:lineRule="auto"/>
+            </w:pPr>
+            <w:r>
+              <w:rPr>
+                <w:b w:val="0"/>
+                <w:color w:val="000000"/>
+                <w:sz w:val="21"/>
+              </w:rPr>
+              <w:t>三张子单继承同一起算和截止 分别判定状态 原单停止执行但关系可追溯</w:t>
+            </w:r>
+          </w:p>
+        </w:tc>
+      </w:tr>
+      <w:tr>
+        <w:trPr>
+          <w:cantSplit/>
+        </w:trPr>
+        <w:tc>
+          <w:tcPr>
+            <w:tcW w:type="dxa" w:w="835"/>
+            <w:vAlign w:val="center"/>
+            <w:shd w:fill="F4F7FA"/>
+            <w:tcMar>
+              <w:top w:w="80" w:type="dxa"/>
+              <w:bottom w:w="80" w:type="dxa"/>
+              <w:left w:w="105" w:type="dxa"/>
+              <w:right w:w="105" w:type="dxa"/>
+            </w:tcMar>
+          </w:tcPr>
+          <w:p>
+            <w:pPr>
+              <w:keepNext w:val="0"/>
+              <w:spacing w:after="0" w:before="0" w:line="276" w:lineRule="auto"/>
+              <w:jc w:val="center"/>
+            </w:pPr>
+            <w:r>
+              <w:rPr>
+                <w:b w:val="0"/>
+                <w:color w:val="000000"/>
+                <w:sz w:val="21"/>
+              </w:rPr>
+              <w:t>A29</w:t>
+            </w:r>
+          </w:p>
+        </w:tc>
+        <w:tc>
+          <w:tcPr>
+            <w:tcW w:type="dxa" w:w="3686"/>
+            <w:vAlign w:val="center"/>
+            <w:shd w:fill="F4F7FA"/>
+            <w:tcMar>
+              <w:top w:w="80" w:type="dxa"/>
+              <w:bottom w:w="80" w:type="dxa"/>
+              <w:left w:w="105" w:type="dxa"/>
+              <w:right w:w="105" w:type="dxa"/>
+            </w:tcMar>
+          </w:tcPr>
+          <w:p>
+            <w:pPr>
+              <w:keepNext w:val="0"/>
+              <w:spacing w:after="0" w:before="0" w:line="276" w:lineRule="auto"/>
+            </w:pPr>
+            <w:r>
+              <w:rPr>
+                <w:b w:val="0"/>
+                <w:color w:val="000000"/>
+                <w:sz w:val="21"/>
+              </w:rPr>
+              <w:t>三张不同截止的未同步发货单合为一张</w:t>
+            </w:r>
+          </w:p>
+        </w:tc>
+        <w:tc>
+          <w:tcPr>
+            <w:tcW w:type="dxa" w:w="5270"/>
+            <w:vAlign w:val="center"/>
+            <w:shd w:fill="F4F7FA"/>
+            <w:tcMar>
+              <w:top w:w="80" w:type="dxa"/>
+              <w:bottom w:w="80" w:type="dxa"/>
+              <w:left w:w="105" w:type="dxa"/>
+              <w:right w:w="105" w:type="dxa"/>
+            </w:tcMar>
+          </w:tcPr>
+          <w:p>
+            <w:pPr>
+              <w:keepNext w:val="0"/>
+              <w:spacing w:after="0" w:before="0" w:line="276" w:lineRule="auto"/>
+            </w:pPr>
+            <w:r>
+              <w:rPr>
+                <w:b w:val="0"/>
+                <w:color w:val="000000"/>
+                <w:sz w:val="21"/>
+              </w:rPr>
+              <w:t>合并单取最早截止 承接最高等级告警 来源单不再重复提醒 各原订单SLA仍独立统计</w:t>
+            </w:r>
+          </w:p>
+        </w:tc>
+      </w:tr>
+      <w:tr>
+        <w:trPr>
+          <w:cantSplit/>
+        </w:trPr>
+        <w:tc>
+          <w:tcPr>
+            <w:tcW w:type="dxa" w:w="835"/>
+            <w:vAlign w:val="center"/>
+            <w:shd w:fill="FFFFFF"/>
+            <w:tcMar>
+              <w:top w:w="80" w:type="dxa"/>
+              <w:bottom w:w="80" w:type="dxa"/>
+              <w:left w:w="105" w:type="dxa"/>
+              <w:right w:w="105" w:type="dxa"/>
+            </w:tcMar>
+          </w:tcPr>
+          <w:p>
+            <w:pPr>
+              <w:keepNext w:val="0"/>
+              <w:spacing w:after="0" w:before="0" w:line="276" w:lineRule="auto"/>
+              <w:jc w:val="center"/>
+            </w:pPr>
+            <w:r>
+              <w:rPr>
+                <w:b w:val="0"/>
+                <w:color w:val="000000"/>
+                <w:sz w:val="21"/>
+              </w:rPr>
+              <w:t>A30</w:t>
+            </w:r>
+          </w:p>
+        </w:tc>
+        <w:tc>
+          <w:tcPr>
+            <w:tcW w:type="dxa" w:w="3686"/>
+            <w:vAlign w:val="center"/>
+            <w:shd w:fill="FFFFFF"/>
+            <w:tcMar>
+              <w:top w:w="80" w:type="dxa"/>
+              <w:bottom w:w="80" w:type="dxa"/>
+              <w:left w:w="105" w:type="dxa"/>
+              <w:right w:w="105" w:type="dxa"/>
+            </w:tcMar>
+          </w:tcPr>
+          <w:p>
+            <w:pPr>
+              <w:keepNext w:val="0"/>
+              <w:spacing w:after="0" w:before="0" w:line="276" w:lineRule="auto"/>
+            </w:pPr>
+            <w:r>
+              <w:rPr>
+                <w:b w:val="0"/>
+                <w:color w:val="000000"/>
+                <w:sz w:val="21"/>
+              </w:rPr>
+              <w:t>旺店通驳回后拆单或合单再同步</w:t>
+            </w:r>
+          </w:p>
+        </w:tc>
+        <w:tc>
+          <w:tcPr>
+            <w:tcW w:type="dxa" w:w="5270"/>
+            <w:vAlign w:val="center"/>
+            <w:shd w:fill="FFFFFF"/>
+            <w:tcMar>
+              <w:top w:w="80" w:type="dxa"/>
+              <w:bottom w:w="80" w:type="dxa"/>
+              <w:left w:w="105" w:type="dxa"/>
+              <w:right w:w="105" w:type="dxa"/>
+            </w:tcMar>
+          </w:tcPr>
+          <w:p>
+            <w:pPr>
+              <w:keepNext w:val="0"/>
+              <w:spacing w:after="0" w:before="0" w:line="276" w:lineRule="auto"/>
+            </w:pPr>
+            <w:r>
+              <w:rPr>
+                <w:b w:val="0"/>
+                <w:color w:val="000000"/>
+                <w:sz w:val="21"/>
+              </w:rPr>
+              <w:t>驳回与重组耗时计入原计时 新结果单继承原截止和未关闭告警 每轮请求可追溯</w:t>
+            </w:r>
+          </w:p>
+        </w:tc>
+      </w:tr>
+      <w:tr>
+        <w:trPr>
+          <w:cantSplit/>
+        </w:trPr>
+        <w:tc>
+          <w:tcPr>
+            <w:tcW w:type="dxa" w:w="835"/>
+            <w:vAlign w:val="center"/>
+            <w:shd w:fill="F4F7FA"/>
+            <w:tcMar>
+              <w:top w:w="80" w:type="dxa"/>
+              <w:bottom w:w="80" w:type="dxa"/>
+              <w:left w:w="105" w:type="dxa"/>
+              <w:right w:w="105" w:type="dxa"/>
+            </w:tcMar>
+          </w:tcPr>
+          <w:p>
+            <w:pPr>
+              <w:keepNext w:val="0"/>
+              <w:spacing w:after="0" w:before="0" w:line="276" w:lineRule="auto"/>
+              <w:jc w:val="center"/>
+            </w:pPr>
+            <w:r>
+              <w:rPr>
+                <w:b w:val="0"/>
+                <w:color w:val="000000"/>
+                <w:sz w:val="21"/>
+              </w:rPr>
+              <w:t>A31</w:t>
+            </w:r>
+          </w:p>
+        </w:tc>
+        <w:tc>
+          <w:tcPr>
+            <w:tcW w:type="dxa" w:w="3686"/>
+            <w:vAlign w:val="center"/>
+            <w:shd w:fill="F4F7FA"/>
+            <w:tcMar>
+              <w:top w:w="80" w:type="dxa"/>
+              <w:bottom w:w="80" w:type="dxa"/>
+              <w:left w:w="105" w:type="dxa"/>
+              <w:right w:w="105" w:type="dxa"/>
+            </w:tcMar>
+          </w:tcPr>
+          <w:p>
+            <w:pPr>
+              <w:keepNext w:val="0"/>
+              <w:spacing w:after="0" w:before="0" w:line="276" w:lineRule="auto"/>
+            </w:pPr>
+            <w:r>
+              <w:rPr>
+                <w:b w:val="0"/>
+                <w:color w:val="000000"/>
+                <w:sz w:val="21"/>
+              </w:rPr>
+              <w:t>已被旺店通接收的单据尝试重组</w:t>
+            </w:r>
+          </w:p>
+        </w:tc>
+        <w:tc>
+          <w:tcPr>
+            <w:tcW w:type="dxa" w:w="5270"/>
+            <w:vAlign w:val="center"/>
+            <w:shd w:fill="F4F7FA"/>
+            <w:tcMar>
+              <w:top w:w="80" w:type="dxa"/>
+              <w:bottom w:w="80" w:type="dxa"/>
+              <w:left w:w="105" w:type="dxa"/>
+              <w:right w:w="105" w:type="dxa"/>
+            </w:tcMar>
+          </w:tcPr>
+          <w:p>
+            <w:pPr>
+              <w:keepNext w:val="0"/>
+              <w:spacing w:after="0" w:before="0" w:line="276" w:lineRule="auto"/>
+            </w:pPr>
+            <w:r>
+              <w:rPr>
+                <w:b w:val="0"/>
+                <w:color w:val="000000"/>
+                <w:sz w:val="21"/>
+              </w:rPr>
+              <w:t>拆单合单入口禁用并说明已同步不可重组 不生成关系批次或新单</w:t>
+            </w:r>
+          </w:p>
+        </w:tc>
+      </w:tr>
+      <w:tr>
+        <w:trPr>
+          <w:cantSplit/>
+        </w:trPr>
+        <w:tc>
+          <w:tcPr>
+            <w:tcW w:type="dxa" w:w="835"/>
+            <w:vAlign w:val="center"/>
+            <w:shd w:fill="FFFFFF"/>
+            <w:tcMar>
+              <w:top w:w="80" w:type="dxa"/>
+              <w:bottom w:w="80" w:type="dxa"/>
+              <w:left w:w="105" w:type="dxa"/>
+              <w:right w:w="105" w:type="dxa"/>
+            </w:tcMar>
+          </w:tcPr>
+          <w:p>
+            <w:pPr>
+              <w:keepNext w:val="0"/>
+              <w:spacing w:after="0" w:before="0" w:line="276" w:lineRule="auto"/>
+              <w:jc w:val="center"/>
+            </w:pPr>
+            <w:r>
+              <w:rPr>
+                <w:b w:val="0"/>
+                <w:color w:val="000000"/>
+                <w:sz w:val="21"/>
+              </w:rPr>
+              <w:t>A32</w:t>
+            </w:r>
+          </w:p>
+        </w:tc>
+        <w:tc>
+          <w:tcPr>
+            <w:tcW w:type="dxa" w:w="3686"/>
+            <w:vAlign w:val="center"/>
+            <w:shd w:fill="FFFFFF"/>
+            <w:tcMar>
+              <w:top w:w="80" w:type="dxa"/>
+              <w:bottom w:w="80" w:type="dxa"/>
+              <w:left w:w="105" w:type="dxa"/>
+              <w:right w:w="105" w:type="dxa"/>
+            </w:tcMar>
+          </w:tcPr>
+          <w:p>
+            <w:pPr>
+              <w:keepNext w:val="0"/>
+              <w:spacing w:after="0" w:before="0" w:line="276" w:lineRule="auto"/>
+            </w:pPr>
+            <w:r>
+              <w:rPr>
+                <w:b w:val="0"/>
+                <w:color w:val="000000"/>
+                <w:sz w:val="21"/>
+              </w:rPr>
+              <w:t>多合一候选中包含一张已同步单</w:t>
+            </w:r>
+          </w:p>
+        </w:tc>
+        <w:tc>
+          <w:tcPr>
+            <w:tcW w:type="dxa" w:w="5270"/>
+            <w:vAlign w:val="center"/>
+            <w:shd w:fill="FFFFFF"/>
+            <w:tcMar>
+              <w:top w:w="80" w:type="dxa"/>
+              <w:bottom w:w="80" w:type="dxa"/>
+              <w:left w:w="105" w:type="dxa"/>
+              <w:right w:w="105" w:type="dxa"/>
+            </w:tcMar>
+          </w:tcPr>
+          <w:p>
+            <w:pPr>
+              <w:keepNext w:val="0"/>
+              <w:spacing w:after="0" w:before="0" w:line="276" w:lineRule="auto"/>
+            </w:pPr>
+            <w:r>
+              <w:rPr>
+                <w:b w:val="0"/>
+                <w:color w:val="000000"/>
+                <w:sz w:val="21"/>
+              </w:rPr>
+              <w:t>整次合单失败 指出阻断单号 保留其他已选项 来源单和告警均不改变</w:t>
             </w:r>
           </w:p>
         </w:tc>

</xml_diff>